<commit_message>
Remove goal loop from report methodology
</commit_message>
<xml_diff>
--- a/docs/PROJECT_REPORT_OUTLINE.docx
+++ b/docs/PROJECT_REPORT_OUTLINE.docx
@@ -100,9 +100,6 @@
             <w:shd w:fill="DDEFEA"/>
           </w:tcPr>
           <w:p>
-            <w:pPr>
-              <w:spacing w:after="0"/>
-            </w:pPr>
             <w:r/>
             <w:r>
               <w:rPr>
@@ -120,9 +117,6 @@
             <w:shd w:fill="DDEFEA"/>
           </w:tcPr>
           <w:p>
-            <w:pPr>
-              <w:spacing w:after="0"/>
-            </w:pPr>
             <w:r/>
             <w:r>
               <w:rPr>
@@ -140,9 +134,6 @@
             <w:shd w:fill="DDEFEA"/>
           </w:tcPr>
           <w:p>
-            <w:pPr>
-              <w:spacing w:after="0"/>
-            </w:pPr>
             <w:r/>
             <w:r>
               <w:rPr>
@@ -160,9 +151,6 @@
             <w:shd w:fill="DDEFEA"/>
           </w:tcPr>
           <w:p>
-            <w:pPr>
-              <w:spacing w:after="0"/>
-            </w:pPr>
             <w:r/>
             <w:r>
               <w:rPr>
@@ -181,9 +169,6 @@
             <w:vAlign w:val="center"/>
           </w:tcPr>
           <w:p>
-            <w:pPr>
-              <w:spacing w:after="0"/>
-            </w:pPr>
             <w:r/>
             <w:r>
               <w:rPr>
@@ -200,9 +185,6 @@
             <w:vAlign w:val="center"/>
           </w:tcPr>
           <w:p>
-            <w:pPr>
-              <w:spacing w:after="0"/>
-            </w:pPr>
             <w:r/>
             <w:r>
               <w:rPr>
@@ -219,9 +201,6 @@
             <w:vAlign w:val="center"/>
           </w:tcPr>
           <w:p>
-            <w:pPr>
-              <w:spacing w:after="0"/>
-            </w:pPr>
             <w:r/>
             <w:r>
               <w:rPr>
@@ -238,9 +217,6 @@
             <w:vAlign w:val="center"/>
           </w:tcPr>
           <w:p>
-            <w:pPr>
-              <w:spacing w:after="0"/>
-            </w:pPr>
             <w:r/>
             <w:r>
               <w:rPr>
@@ -259,9 +235,6 @@
             <w:vAlign w:val="center"/>
           </w:tcPr>
           <w:p>
-            <w:pPr>
-              <w:spacing w:after="0"/>
-            </w:pPr>
             <w:r/>
             <w:r>
               <w:rPr>
@@ -278,9 +251,6 @@
             <w:vAlign w:val="center"/>
           </w:tcPr>
           <w:p>
-            <w:pPr>
-              <w:spacing w:after="0"/>
-            </w:pPr>
             <w:r/>
             <w:r>
               <w:rPr>
@@ -297,9 +267,6 @@
             <w:vAlign w:val="center"/>
           </w:tcPr>
           <w:p>
-            <w:pPr>
-              <w:spacing w:after="0"/>
-            </w:pPr>
             <w:r/>
             <w:r>
               <w:rPr>
@@ -316,9 +283,6 @@
             <w:vAlign w:val="center"/>
           </w:tcPr>
           <w:p>
-            <w:pPr>
-              <w:spacing w:after="0"/>
-            </w:pPr>
             <w:r/>
             <w:r>
               <w:rPr>
@@ -337,9 +301,6 @@
             <w:vAlign w:val="center"/>
           </w:tcPr>
           <w:p>
-            <w:pPr>
-              <w:spacing w:after="0"/>
-            </w:pPr>
             <w:r/>
             <w:r>
               <w:rPr>
@@ -356,9 +317,6 @@
             <w:vAlign w:val="center"/>
           </w:tcPr>
           <w:p>
-            <w:pPr>
-              <w:spacing w:after="0"/>
-            </w:pPr>
             <w:r/>
             <w:r>
               <w:rPr>
@@ -375,9 +333,6 @@
             <w:vAlign w:val="center"/>
           </w:tcPr>
           <w:p>
-            <w:pPr>
-              <w:spacing w:after="0"/>
-            </w:pPr>
             <w:r/>
             <w:r>
               <w:rPr>
@@ -394,9 +349,6 @@
             <w:vAlign w:val="center"/>
           </w:tcPr>
           <w:p>
-            <w:pPr>
-              <w:spacing w:after="0"/>
-            </w:pPr>
             <w:r/>
             <w:r>
               <w:rPr>
@@ -415,9 +367,6 @@
             <w:vAlign w:val="center"/>
           </w:tcPr>
           <w:p>
-            <w:pPr>
-              <w:spacing w:after="0"/>
-            </w:pPr>
             <w:r/>
             <w:r>
               <w:rPr>
@@ -434,9 +383,6 @@
             <w:vAlign w:val="center"/>
           </w:tcPr>
           <w:p>
-            <w:pPr>
-              <w:spacing w:after="0"/>
-            </w:pPr>
             <w:r/>
             <w:r>
               <w:rPr>
@@ -453,9 +399,6 @@
             <w:vAlign w:val="center"/>
           </w:tcPr>
           <w:p>
-            <w:pPr>
-              <w:spacing w:after="0"/>
-            </w:pPr>
             <w:r/>
             <w:r>
               <w:rPr>
@@ -472,9 +415,6 @@
             <w:vAlign w:val="center"/>
           </w:tcPr>
           <w:p>
-            <w:pPr>
-              <w:spacing w:after="0"/>
-            </w:pPr>
             <w:r/>
             <w:r>
               <w:rPr>
@@ -520,9 +460,6 @@
             <w:shd w:fill="DDEFEA"/>
           </w:tcPr>
           <w:p>
-            <w:pPr>
-              <w:spacing w:after="0"/>
-            </w:pPr>
             <w:r/>
             <w:r>
               <w:rPr>
@@ -540,9 +477,6 @@
             <w:shd w:fill="DDEFEA"/>
           </w:tcPr>
           <w:p>
-            <w:pPr>
-              <w:spacing w:after="0"/>
-            </w:pPr>
             <w:r/>
             <w:r>
               <w:rPr>
@@ -560,9 +494,6 @@
             <w:shd w:fill="DDEFEA"/>
           </w:tcPr>
           <w:p>
-            <w:pPr>
-              <w:spacing w:after="0"/>
-            </w:pPr>
             <w:r/>
             <w:r>
               <w:rPr>
@@ -581,9 +512,6 @@
             <w:vAlign w:val="center"/>
           </w:tcPr>
           <w:p>
-            <w:pPr>
-              <w:spacing w:after="0"/>
-            </w:pPr>
             <w:r/>
             <w:r>
               <w:rPr>
@@ -600,9 +528,6 @@
             <w:vAlign w:val="center"/>
           </w:tcPr>
           <w:p>
-            <w:pPr>
-              <w:spacing w:after="0"/>
-            </w:pPr>
             <w:r/>
             <w:r>
               <w:rPr>
@@ -619,9 +544,6 @@
             <w:vAlign w:val="center"/>
           </w:tcPr>
           <w:p>
-            <w:pPr>
-              <w:spacing w:after="0"/>
-            </w:pPr>
             <w:r/>
             <w:r>
               <w:rPr>
@@ -640,9 +562,6 @@
             <w:vAlign w:val="center"/>
           </w:tcPr>
           <w:p>
-            <w:pPr>
-              <w:spacing w:after="0"/>
-            </w:pPr>
             <w:r/>
             <w:r>
               <w:rPr>
@@ -659,9 +578,6 @@
             <w:vAlign w:val="center"/>
           </w:tcPr>
           <w:p>
-            <w:pPr>
-              <w:spacing w:after="0"/>
-            </w:pPr>
             <w:r/>
             <w:r>
               <w:rPr>
@@ -678,9 +594,6 @@
             <w:vAlign w:val="center"/>
           </w:tcPr>
           <w:p>
-            <w:pPr>
-              <w:spacing w:after="0"/>
-            </w:pPr>
             <w:r/>
             <w:r>
               <w:rPr>
@@ -699,9 +612,6 @@
             <w:vAlign w:val="center"/>
           </w:tcPr>
           <w:p>
-            <w:pPr>
-              <w:spacing w:after="0"/>
-            </w:pPr>
             <w:r/>
             <w:r>
               <w:rPr>
@@ -718,9 +628,6 @@
             <w:vAlign w:val="center"/>
           </w:tcPr>
           <w:p>
-            <w:pPr>
-              <w:spacing w:after="0"/>
-            </w:pPr>
             <w:r/>
             <w:r>
               <w:rPr>
@@ -737,9 +644,6 @@
             <w:vAlign w:val="center"/>
           </w:tcPr>
           <w:p>
-            <w:pPr>
-              <w:spacing w:after="0"/>
-            </w:pPr>
             <w:r/>
             <w:r>
               <w:rPr>
@@ -758,9 +662,6 @@
             <w:vAlign w:val="center"/>
           </w:tcPr>
           <w:p>
-            <w:pPr>
-              <w:spacing w:after="0"/>
-            </w:pPr>
             <w:r/>
             <w:r>
               <w:rPr>
@@ -777,9 +678,6 @@
             <w:vAlign w:val="center"/>
           </w:tcPr>
           <w:p>
-            <w:pPr>
-              <w:spacing w:after="0"/>
-            </w:pPr>
             <w:r/>
             <w:r>
               <w:rPr>
@@ -796,9 +694,6 @@
             <w:vAlign w:val="center"/>
           </w:tcPr>
           <w:p>
-            <w:pPr>
-              <w:spacing w:after="0"/>
-            </w:pPr>
             <w:r/>
             <w:r>
               <w:rPr>
@@ -817,9 +712,6 @@
             <w:vAlign w:val="center"/>
           </w:tcPr>
           <w:p>
-            <w:pPr>
-              <w:spacing w:after="0"/>
-            </w:pPr>
             <w:r/>
             <w:r>
               <w:rPr>
@@ -836,9 +728,6 @@
             <w:vAlign w:val="center"/>
           </w:tcPr>
           <w:p>
-            <w:pPr>
-              <w:spacing w:after="0"/>
-            </w:pPr>
             <w:r/>
             <w:r>
               <w:rPr>
@@ -855,9 +744,6 @@
             <w:vAlign w:val="center"/>
           </w:tcPr>
           <w:p>
-            <w:pPr>
-              <w:spacing w:after="0"/>
-            </w:pPr>
             <w:r/>
             <w:r>
               <w:rPr>
@@ -954,9 +840,6 @@
             <w:shd w:fill="DDEFEA"/>
           </w:tcPr>
           <w:p>
-            <w:pPr>
-              <w:spacing w:after="0"/>
-            </w:pPr>
             <w:r/>
             <w:r>
               <w:rPr>
@@ -974,9 +857,6 @@
             <w:shd w:fill="DDEFEA"/>
           </w:tcPr>
           <w:p>
-            <w:pPr>
-              <w:spacing w:after="0"/>
-            </w:pPr>
             <w:r/>
             <w:r>
               <w:rPr>
@@ -994,9 +874,6 @@
             <w:shd w:fill="DDEFEA"/>
           </w:tcPr>
           <w:p>
-            <w:pPr>
-              <w:spacing w:after="0"/>
-            </w:pPr>
             <w:r/>
             <w:r>
               <w:rPr>
@@ -1014,9 +891,6 @@
             <w:shd w:fill="DDEFEA"/>
           </w:tcPr>
           <w:p>
-            <w:pPr>
-              <w:spacing w:after="0"/>
-            </w:pPr>
             <w:r/>
             <w:r>
               <w:rPr>
@@ -1034,9 +908,6 @@
             <w:shd w:fill="DDEFEA"/>
           </w:tcPr>
           <w:p>
-            <w:pPr>
-              <w:spacing w:after="0"/>
-            </w:pPr>
             <w:r/>
             <w:r>
               <w:rPr>
@@ -1055,9 +926,6 @@
             <w:vAlign w:val="center"/>
           </w:tcPr>
           <w:p>
-            <w:pPr>
-              <w:spacing w:after="0"/>
-            </w:pPr>
             <w:r/>
             <w:r>
               <w:rPr>
@@ -1074,9 +942,6 @@
             <w:vAlign w:val="center"/>
           </w:tcPr>
           <w:p>
-            <w:pPr>
-              <w:spacing w:after="0"/>
-            </w:pPr>
             <w:r/>
             <w:r>
               <w:rPr>
@@ -1093,9 +958,6 @@
             <w:vAlign w:val="center"/>
           </w:tcPr>
           <w:p>
-            <w:pPr>
-              <w:spacing w:after="0"/>
-            </w:pPr>
             <w:r/>
             <w:r>
               <w:rPr>
@@ -1112,9 +974,6 @@
             <w:vAlign w:val="center"/>
           </w:tcPr>
           <w:p>
-            <w:pPr>
-              <w:spacing w:after="0"/>
-            </w:pPr>
             <w:r/>
             <w:r>
               <w:rPr>
@@ -1131,9 +990,6 @@
             <w:vAlign w:val="center"/>
           </w:tcPr>
           <w:p>
-            <w:pPr>
-              <w:spacing w:after="0"/>
-            </w:pPr>
             <w:r/>
             <w:r>
               <w:rPr>
@@ -1152,9 +1008,6 @@
             <w:vAlign w:val="center"/>
           </w:tcPr>
           <w:p>
-            <w:pPr>
-              <w:spacing w:after="0"/>
-            </w:pPr>
             <w:r/>
             <w:r>
               <w:rPr>
@@ -1171,9 +1024,6 @@
             <w:vAlign w:val="center"/>
           </w:tcPr>
           <w:p>
-            <w:pPr>
-              <w:spacing w:after="0"/>
-            </w:pPr>
             <w:r/>
             <w:r>
               <w:rPr>
@@ -1190,9 +1040,6 @@
             <w:vAlign w:val="center"/>
           </w:tcPr>
           <w:p>
-            <w:pPr>
-              <w:spacing w:after="0"/>
-            </w:pPr>
             <w:r/>
             <w:r>
               <w:rPr>
@@ -1209,9 +1056,6 @@
             <w:vAlign w:val="center"/>
           </w:tcPr>
           <w:p>
-            <w:pPr>
-              <w:spacing w:after="0"/>
-            </w:pPr>
             <w:r/>
             <w:r>
               <w:rPr>
@@ -1228,9 +1072,6 @@
             <w:vAlign w:val="center"/>
           </w:tcPr>
           <w:p>
-            <w:pPr>
-              <w:spacing w:after="0"/>
-            </w:pPr>
             <w:r/>
             <w:r>
               <w:rPr>
@@ -1249,9 +1090,6 @@
             <w:vAlign w:val="center"/>
           </w:tcPr>
           <w:p>
-            <w:pPr>
-              <w:spacing w:after="0"/>
-            </w:pPr>
             <w:r/>
             <w:r>
               <w:rPr>
@@ -1268,16 +1106,13 @@
             <w:vAlign w:val="center"/>
           </w:tcPr>
           <w:p>
-            <w:pPr>
-              <w:spacing w:after="0"/>
-            </w:pPr>
             <w:r/>
             <w:r>
               <w:rPr>
                 <w:b w:val="0"/>
                 <w:sz w:val="17"/>
               </w:rPr>
-              <w:t>Goal 기반 설계 루프</w:t>
+              <w:t>화면 설계서</w:t>
             </w:r>
           </w:p>
         </w:tc>
@@ -1287,9 +1122,6 @@
             <w:vAlign w:val="center"/>
           </w:tcPr>
           <w:p>
-            <w:pPr>
-              <w:spacing w:after="0"/>
-            </w:pPr>
             <w:r/>
             <w:r>
               <w:rPr>
@@ -1306,9 +1138,6 @@
             <w:vAlign w:val="center"/>
           </w:tcPr>
           <w:p>
-            <w:pPr>
-              <w:spacing w:after="0"/>
-            </w:pPr>
             <w:r/>
             <w:r>
               <w:rPr>
@@ -1325,16 +1154,13 @@
             <w:vAlign w:val="center"/>
           </w:tcPr>
           <w:p>
-            <w:pPr>
-              <w:spacing w:after="0"/>
-            </w:pPr>
             <w:r/>
             <w:r>
               <w:rPr>
                 <w:b w:val="0"/>
                 <w:sz w:val="17"/>
               </w:rPr>
-              <w:t>기능 설계, 화면 흐름, Goal 루프</w:t>
+              <w:t>화면 설계서, 입력/출력 화면 예시</w:t>
             </w:r>
           </w:p>
         </w:tc>
@@ -1346,9 +1172,6 @@
             <w:vAlign w:val="center"/>
           </w:tcPr>
           <w:p>
-            <w:pPr>
-              <w:spacing w:after="0"/>
-            </w:pPr>
             <w:r/>
             <w:r>
               <w:rPr>
@@ -1365,9 +1188,6 @@
             <w:vAlign w:val="center"/>
           </w:tcPr>
           <w:p>
-            <w:pPr>
-              <w:spacing w:after="0"/>
-            </w:pPr>
             <w:r/>
             <w:r>
               <w:rPr>
@@ -1384,9 +1204,6 @@
             <w:vAlign w:val="center"/>
           </w:tcPr>
           <w:p>
-            <w:pPr>
-              <w:spacing w:after="0"/>
-            </w:pPr>
             <w:r/>
             <w:r>
               <w:rPr>
@@ -1403,9 +1220,6 @@
             <w:vAlign w:val="center"/>
           </w:tcPr>
           <w:p>
-            <w:pPr>
-              <w:spacing w:after="0"/>
-            </w:pPr>
             <w:r/>
             <w:r>
               <w:rPr>
@@ -1422,9 +1236,6 @@
             <w:vAlign w:val="center"/>
           </w:tcPr>
           <w:p>
-            <w:pPr>
-              <w:spacing w:after="0"/>
-            </w:pPr>
             <w:r/>
             <w:r>
               <w:rPr>
@@ -1443,9 +1254,6 @@
             <w:vAlign w:val="center"/>
           </w:tcPr>
           <w:p>
-            <w:pPr>
-              <w:spacing w:after="0"/>
-            </w:pPr>
             <w:r/>
             <w:r>
               <w:rPr>
@@ -1462,9 +1270,6 @@
             <w:vAlign w:val="center"/>
           </w:tcPr>
           <w:p>
-            <w:pPr>
-              <w:spacing w:after="0"/>
-            </w:pPr>
             <w:r/>
             <w:r>
               <w:rPr>
@@ -1481,9 +1286,6 @@
             <w:vAlign w:val="center"/>
           </w:tcPr>
           <w:p>
-            <w:pPr>
-              <w:spacing w:after="0"/>
-            </w:pPr>
             <w:r/>
             <w:r>
               <w:rPr>
@@ -1500,9 +1302,6 @@
             <w:vAlign w:val="center"/>
           </w:tcPr>
           <w:p>
-            <w:pPr>
-              <w:spacing w:after="0"/>
-            </w:pPr>
             <w:r/>
             <w:r>
               <w:rPr>
@@ -1519,9 +1318,6 @@
             <w:vAlign w:val="center"/>
           </w:tcPr>
           <w:p>
-            <w:pPr>
-              <w:spacing w:after="0"/>
-            </w:pPr>
             <w:r/>
             <w:r>
               <w:rPr>
@@ -1540,9 +1336,6 @@
             <w:vAlign w:val="center"/>
           </w:tcPr>
           <w:p>
-            <w:pPr>
-              <w:spacing w:after="0"/>
-            </w:pPr>
             <w:r/>
             <w:r>
               <w:rPr>
@@ -1559,9 +1352,6 @@
             <w:vAlign w:val="center"/>
           </w:tcPr>
           <w:p>
-            <w:pPr>
-              <w:spacing w:after="0"/>
-            </w:pPr>
             <w:r/>
             <w:r>
               <w:rPr>
@@ -1578,9 +1368,6 @@
             <w:vAlign w:val="center"/>
           </w:tcPr>
           <w:p>
-            <w:pPr>
-              <w:spacing w:after="0"/>
-            </w:pPr>
             <w:r/>
             <w:r>
               <w:rPr>
@@ -1597,9 +1384,6 @@
             <w:vAlign w:val="center"/>
           </w:tcPr>
           <w:p>
-            <w:pPr>
-              <w:spacing w:after="0"/>
-            </w:pPr>
             <w:r/>
             <w:r>
               <w:rPr>
@@ -1616,9 +1400,6 @@
             <w:vAlign w:val="center"/>
           </w:tcPr>
           <w:p>
-            <w:pPr>
-              <w:spacing w:after="0"/>
-            </w:pPr>
             <w:r/>
             <w:r>
               <w:rPr>
@@ -1707,9 +1488,6 @@
             <w:shd w:fill="DDEFEA"/>
           </w:tcPr>
           <w:p>
-            <w:pPr>
-              <w:spacing w:after="0"/>
-            </w:pPr>
             <w:r/>
             <w:r>
               <w:rPr>
@@ -1727,9 +1505,6 @@
             <w:shd w:fill="DDEFEA"/>
           </w:tcPr>
           <w:p>
-            <w:pPr>
-              <w:spacing w:after="0"/>
-            </w:pPr>
             <w:r/>
             <w:r>
               <w:rPr>
@@ -1747,9 +1522,6 @@
             <w:shd w:fill="DDEFEA"/>
           </w:tcPr>
           <w:p>
-            <w:pPr>
-              <w:spacing w:after="0"/>
-            </w:pPr>
             <w:r/>
             <w:r>
               <w:rPr>
@@ -1767,9 +1539,6 @@
             <w:shd w:fill="DDEFEA"/>
           </w:tcPr>
           <w:p>
-            <w:pPr>
-              <w:spacing w:after="0"/>
-            </w:pPr>
             <w:r/>
             <w:r>
               <w:rPr>
@@ -1787,9 +1556,6 @@
             <w:shd w:fill="DDEFEA"/>
           </w:tcPr>
           <w:p>
-            <w:pPr>
-              <w:spacing w:after="0"/>
-            </w:pPr>
             <w:r/>
             <w:r>
               <w:rPr>
@@ -1808,9 +1574,6 @@
             <w:vAlign w:val="center"/>
           </w:tcPr>
           <w:p>
-            <w:pPr>
-              <w:spacing w:after="0"/>
-            </w:pPr>
             <w:r/>
             <w:r>
               <w:rPr>
@@ -1827,9 +1590,6 @@
             <w:vAlign w:val="center"/>
           </w:tcPr>
           <w:p>
-            <w:pPr>
-              <w:spacing w:after="0"/>
-            </w:pPr>
             <w:r/>
             <w:r>
               <w:rPr>
@@ -1846,9 +1606,6 @@
             <w:vAlign w:val="center"/>
           </w:tcPr>
           <w:p>
-            <w:pPr>
-              <w:spacing w:after="0"/>
-            </w:pPr>
             <w:r/>
             <w:r>
               <w:rPr>
@@ -1865,9 +1622,6 @@
             <w:vAlign w:val="center"/>
           </w:tcPr>
           <w:p>
-            <w:pPr>
-              <w:spacing w:after="0"/>
-            </w:pPr>
             <w:r/>
             <w:r>
               <w:rPr>
@@ -1884,9 +1638,6 @@
             <w:vAlign w:val="center"/>
           </w:tcPr>
           <w:p>
-            <w:pPr>
-              <w:spacing w:after="0"/>
-            </w:pPr>
             <w:r/>
             <w:r>
               <w:rPr>
@@ -1905,9 +1656,6 @@
             <w:vAlign w:val="center"/>
           </w:tcPr>
           <w:p>
-            <w:pPr>
-              <w:spacing w:after="0"/>
-            </w:pPr>
             <w:r/>
             <w:r>
               <w:rPr>
@@ -1924,9 +1672,6 @@
             <w:vAlign w:val="center"/>
           </w:tcPr>
           <w:p>
-            <w:pPr>
-              <w:spacing w:after="0"/>
-            </w:pPr>
             <w:r/>
             <w:r>
               <w:rPr>
@@ -1943,9 +1688,6 @@
             <w:vAlign w:val="center"/>
           </w:tcPr>
           <w:p>
-            <w:pPr>
-              <w:spacing w:after="0"/>
-            </w:pPr>
             <w:r/>
             <w:r>
               <w:rPr>
@@ -1962,9 +1704,6 @@
             <w:vAlign w:val="center"/>
           </w:tcPr>
           <w:p>
-            <w:pPr>
-              <w:spacing w:after="0"/>
-            </w:pPr>
             <w:r/>
             <w:r>
               <w:rPr>
@@ -1981,9 +1720,6 @@
             <w:vAlign w:val="center"/>
           </w:tcPr>
           <w:p>
-            <w:pPr>
-              <w:spacing w:after="0"/>
-            </w:pPr>
             <w:r/>
             <w:r>
               <w:rPr>
@@ -2002,9 +1738,6 @@
             <w:vAlign w:val="center"/>
           </w:tcPr>
           <w:p>
-            <w:pPr>
-              <w:spacing w:after="0"/>
-            </w:pPr>
             <w:r/>
             <w:r>
               <w:rPr>
@@ -2021,9 +1754,6 @@
             <w:vAlign w:val="center"/>
           </w:tcPr>
           <w:p>
-            <w:pPr>
-              <w:spacing w:after="0"/>
-            </w:pPr>
             <w:r/>
             <w:r>
               <w:rPr>
@@ -2040,9 +1770,6 @@
             <w:vAlign w:val="center"/>
           </w:tcPr>
           <w:p>
-            <w:pPr>
-              <w:spacing w:after="0"/>
-            </w:pPr>
             <w:r/>
             <w:r>
               <w:rPr>
@@ -2059,9 +1786,6 @@
             <w:vAlign w:val="center"/>
           </w:tcPr>
           <w:p>
-            <w:pPr>
-              <w:spacing w:after="0"/>
-            </w:pPr>
             <w:r/>
             <w:r>
               <w:rPr>
@@ -2078,9 +1802,6 @@
             <w:vAlign w:val="center"/>
           </w:tcPr>
           <w:p>
-            <w:pPr>
-              <w:spacing w:after="0"/>
-            </w:pPr>
             <w:r/>
             <w:r>
               <w:rPr>
@@ -2099,9 +1820,6 @@
             <w:vAlign w:val="center"/>
           </w:tcPr>
           <w:p>
-            <w:pPr>
-              <w:spacing w:after="0"/>
-            </w:pPr>
             <w:r/>
             <w:r>
               <w:rPr>
@@ -2118,9 +1836,6 @@
             <w:vAlign w:val="center"/>
           </w:tcPr>
           <w:p>
-            <w:pPr>
-              <w:spacing w:after="0"/>
-            </w:pPr>
             <w:r/>
             <w:r>
               <w:rPr>
@@ -2137,9 +1852,6 @@
             <w:vAlign w:val="center"/>
           </w:tcPr>
           <w:p>
-            <w:pPr>
-              <w:spacing w:after="0"/>
-            </w:pPr>
             <w:r/>
             <w:r>
               <w:rPr>
@@ -2156,9 +1868,6 @@
             <w:vAlign w:val="center"/>
           </w:tcPr>
           <w:p>
-            <w:pPr>
-              <w:spacing w:after="0"/>
-            </w:pPr>
             <w:r/>
             <w:r>
               <w:rPr>
@@ -2175,9 +1884,6 @@
             <w:vAlign w:val="center"/>
           </w:tcPr>
           <w:p>
-            <w:pPr>
-              <w:spacing w:after="0"/>
-            </w:pPr>
             <w:r/>
             <w:r>
               <w:rPr>
@@ -2196,9 +1902,6 @@
             <w:vAlign w:val="center"/>
           </w:tcPr>
           <w:p>
-            <w:pPr>
-              <w:spacing w:after="0"/>
-            </w:pPr>
             <w:r/>
             <w:r>
               <w:rPr>
@@ -2215,9 +1918,6 @@
             <w:vAlign w:val="center"/>
           </w:tcPr>
           <w:p>
-            <w:pPr>
-              <w:spacing w:after="0"/>
-            </w:pPr>
             <w:r/>
             <w:r>
               <w:rPr>
@@ -2234,9 +1934,6 @@
             <w:vAlign w:val="center"/>
           </w:tcPr>
           <w:p>
-            <w:pPr>
-              <w:spacing w:after="0"/>
-            </w:pPr>
             <w:r/>
             <w:r>
               <w:rPr>
@@ -2253,9 +1950,6 @@
             <w:vAlign w:val="center"/>
           </w:tcPr>
           <w:p>
-            <w:pPr>
-              <w:spacing w:after="0"/>
-            </w:pPr>
             <w:r/>
             <w:r>
               <w:rPr>
@@ -2272,9 +1966,6 @@
             <w:vAlign w:val="center"/>
           </w:tcPr>
           <w:p>
-            <w:pPr>
-              <w:spacing w:after="0"/>
-            </w:pPr>
             <w:r/>
             <w:r>
               <w:rPr>
@@ -2293,9 +1984,6 @@
             <w:vAlign w:val="center"/>
           </w:tcPr>
           <w:p>
-            <w:pPr>
-              <w:spacing w:after="0"/>
-            </w:pPr>
             <w:r/>
             <w:r>
               <w:rPr>
@@ -2312,9 +2000,6 @@
             <w:vAlign w:val="center"/>
           </w:tcPr>
           <w:p>
-            <w:pPr>
-              <w:spacing w:after="0"/>
-            </w:pPr>
             <w:r/>
             <w:r>
               <w:rPr>
@@ -2331,9 +2016,6 @@
             <w:vAlign w:val="center"/>
           </w:tcPr>
           <w:p>
-            <w:pPr>
-              <w:spacing w:after="0"/>
-            </w:pPr>
             <w:r/>
             <w:r>
               <w:rPr>
@@ -2350,9 +2032,6 @@
             <w:vAlign w:val="center"/>
           </w:tcPr>
           <w:p>
-            <w:pPr>
-              <w:spacing w:after="0"/>
-            </w:pPr>
             <w:r/>
             <w:r>
               <w:rPr>
@@ -2369,9 +2048,6 @@
             <w:vAlign w:val="center"/>
           </w:tcPr>
           <w:p>
-            <w:pPr>
-              <w:spacing w:after="0"/>
-            </w:pPr>
             <w:r/>
             <w:r>
               <w:rPr>
@@ -2390,9 +2066,6 @@
             <w:vAlign w:val="center"/>
           </w:tcPr>
           <w:p>
-            <w:pPr>
-              <w:spacing w:after="0"/>
-            </w:pPr>
             <w:r/>
             <w:r>
               <w:rPr>
@@ -2409,9 +2082,6 @@
             <w:vAlign w:val="center"/>
           </w:tcPr>
           <w:p>
-            <w:pPr>
-              <w:spacing w:after="0"/>
-            </w:pPr>
             <w:r/>
             <w:r>
               <w:rPr>
@@ -2428,9 +2098,6 @@
             <w:vAlign w:val="center"/>
           </w:tcPr>
           <w:p>
-            <w:pPr>
-              <w:spacing w:after="0"/>
-            </w:pPr>
             <w:r/>
             <w:r>
               <w:rPr>
@@ -2447,9 +2114,6 @@
             <w:vAlign w:val="center"/>
           </w:tcPr>
           <w:p>
-            <w:pPr>
-              <w:spacing w:after="0"/>
-            </w:pPr>
             <w:r/>
             <w:r>
               <w:rPr>
@@ -2466,9 +2130,6 @@
             <w:vAlign w:val="center"/>
           </w:tcPr>
           <w:p>
-            <w:pPr>
-              <w:spacing w:after="0"/>
-            </w:pPr>
             <w:r/>
             <w:r>
               <w:rPr>
@@ -2487,9 +2148,6 @@
             <w:vAlign w:val="center"/>
           </w:tcPr>
           <w:p>
-            <w:pPr>
-              <w:spacing w:after="0"/>
-            </w:pPr>
             <w:r/>
             <w:r>
               <w:rPr>
@@ -2506,9 +2164,6 @@
             <w:vAlign w:val="center"/>
           </w:tcPr>
           <w:p>
-            <w:pPr>
-              <w:spacing w:after="0"/>
-            </w:pPr>
             <w:r/>
             <w:r>
               <w:rPr>
@@ -2525,9 +2180,6 @@
             <w:vAlign w:val="center"/>
           </w:tcPr>
           <w:p>
-            <w:pPr>
-              <w:spacing w:after="0"/>
-            </w:pPr>
             <w:r/>
             <w:r>
               <w:rPr>
@@ -2544,9 +2196,6 @@
             <w:vAlign w:val="center"/>
           </w:tcPr>
           <w:p>
-            <w:pPr>
-              <w:spacing w:after="0"/>
-            </w:pPr>
             <w:r/>
             <w:r>
               <w:rPr>
@@ -2563,9 +2212,6 @@
             <w:vAlign w:val="center"/>
           </w:tcPr>
           <w:p>
-            <w:pPr>
-              <w:spacing w:after="0"/>
-            </w:pPr>
             <w:r/>
             <w:r>
               <w:rPr>
@@ -2584,9 +2230,6 @@
             <w:vAlign w:val="center"/>
           </w:tcPr>
           <w:p>
-            <w:pPr>
-              <w:spacing w:after="0"/>
-            </w:pPr>
             <w:r/>
             <w:r>
               <w:rPr>
@@ -2603,9 +2246,6 @@
             <w:vAlign w:val="center"/>
           </w:tcPr>
           <w:p>
-            <w:pPr>
-              <w:spacing w:after="0"/>
-            </w:pPr>
             <w:r/>
             <w:r>
               <w:rPr>
@@ -2622,9 +2262,6 @@
             <w:vAlign w:val="center"/>
           </w:tcPr>
           <w:p>
-            <w:pPr>
-              <w:spacing w:after="0"/>
-            </w:pPr>
             <w:r/>
             <w:r>
               <w:rPr>
@@ -2641,9 +2278,6 @@
             <w:vAlign w:val="center"/>
           </w:tcPr>
           <w:p>
-            <w:pPr>
-              <w:spacing w:after="0"/>
-            </w:pPr>
             <w:r/>
             <w:r>
               <w:rPr>
@@ -2660,9 +2294,6 @@
             <w:vAlign w:val="center"/>
           </w:tcPr>
           <w:p>
-            <w:pPr>
-              <w:spacing w:after="0"/>
-            </w:pPr>
             <w:r/>
             <w:r>
               <w:rPr>
@@ -2729,19 +2360,19 @@
         <w:pStyle w:val="Heading1"/>
       </w:pPr>
       <w:r>
-        <w:t>4. 설계: Goal 기반 설계 루프</w:t>
+        <w:t>4. 설계: 화면 설계서</w:t>
       </w:r>
     </w:p>
     <w:p>
       <w:r>
-        <w:t>이 단계에서 사용한 기법은 Goal 기반 설계 루프 하나이다. 목표 상태를 먼저 정하고, 입력-처리-출력-검토 과정을 반복하면서 기능을 구체화한다.</w:t>
+        <w:t>이 단계에서 사용한 기법은 화면 설계서 하나이다. 화면 설계서는 시스템을 사용하는 사용자 정의, 메뉴 구성, 입력 항목, 출력 화면 예시를 구체적으로 정리하는 문서이다. PPT 자료에서 설명한 것처럼 설계 단계에서는 구현 전에 사용자가 보게 될 화면과 흐름을 먼저 구체화해야 하므로, 본 프로젝트에서는 화면 설계서를 대표 기법으로 사용한다.</w:t>
       </w:r>
     </w:p>
     <w:p>
       <w:r>
         <w:drawing>
           <wp:inline xmlns:a="http://schemas.openxmlformats.org/drawingml/2006/main" xmlns:pic="http://schemas.openxmlformats.org/drawingml/2006/picture">
-            <wp:extent cx="6492240" cy="3651885"/>
+            <wp:extent cx="6492240" cy="4057650"/>
             <wp:docPr id="3" name="Picture 3"/>
             <wp:cNvGraphicFramePr>
               <a:graphicFrameLocks noChangeAspect="1"/>
@@ -2750,7 +2381,7 @@
               <a:graphicData uri="http://schemas.openxmlformats.org/drawingml/2006/picture">
                 <pic:pic>
                   <pic:nvPicPr>
-                    <pic:cNvPr id="0" name="goal_loop_design.png"/>
+                    <pic:cNvPr id="0" name="screen_design.png"/>
                     <pic:cNvPicPr/>
                   </pic:nvPicPr>
                   <pic:blipFill>
@@ -2762,7 +2393,7 @@
                   <pic:spPr>
                     <a:xfrm>
                       <a:off x="0" y="0"/>
-                      <a:ext cx="6492240" cy="3651885"/>
+                      <a:ext cx="6492240" cy="4057650"/>
                     </a:xfrm>
                     <a:prstGeom prst="rect"/>
                   </pic:spPr>
@@ -2792,16 +2423,13 @@
             <w:shd w:fill="DDEFEA"/>
           </w:tcPr>
           <w:p>
-            <w:pPr>
-              <w:spacing w:after="0"/>
-            </w:pPr>
             <w:r/>
             <w:r>
               <w:rPr>
                 <w:b/>
                 <w:sz w:val="17"/>
               </w:rPr>
-              <w:t>루프 요소</w:t>
+              <w:t>구성 요소</w:t>
             </w:r>
           </w:p>
         </w:tc>
@@ -2812,9 +2440,6 @@
             <w:shd w:fill="DDEFEA"/>
           </w:tcPr>
           <w:p>
-            <w:pPr>
-              <w:spacing w:after="0"/>
-            </w:pPr>
             <w:r/>
             <w:r>
               <w:rPr>
@@ -2833,16 +2458,13 @@
             <w:vAlign w:val="center"/>
           </w:tcPr>
           <w:p>
-            <w:pPr>
-              <w:spacing w:after="0"/>
-            </w:pPr>
             <w:r/>
             <w:r>
               <w:rPr>
                 <w:b w:val="0"/>
                 <w:sz w:val="17"/>
               </w:rPr>
-              <w:t>Goal</w:t>
+              <w:t>사용자 정의</w:t>
             </w:r>
           </w:p>
         </w:tc>
@@ -2852,16 +2474,13 @@
             <w:vAlign w:val="center"/>
           </w:tcPr>
           <w:p>
-            <w:pPr>
-              <w:spacing w:after="0"/>
-            </w:pPr>
             <w:r/>
             <w:r>
               <w:rPr>
                 <w:b w:val="0"/>
                 <w:sz w:val="17"/>
               </w:rPr>
-              <w:t>신뢰도 높은 병원 블로그 글 생성과 의료광고 위험 표현 감소</w:t>
+              <w:t>개원의, 병원 마케팅 담당자, 의료진 검수자</w:t>
             </w:r>
           </w:p>
         </w:tc>
@@ -2873,16 +2492,13 @@
             <w:vAlign w:val="center"/>
           </w:tcPr>
           <w:p>
-            <w:pPr>
-              <w:spacing w:after="0"/>
-            </w:pPr>
             <w:r/>
             <w:r>
               <w:rPr>
                 <w:b w:val="0"/>
                 <w:sz w:val="17"/>
               </w:rPr>
-              <w:t>Input</w:t>
+              <w:t>메뉴 구성</w:t>
             </w:r>
           </w:p>
         </w:tc>
@@ -2892,16 +2508,13 @@
             <w:vAlign w:val="center"/>
           </w:tcPr>
           <w:p>
-            <w:pPr>
-              <w:spacing w:after="0"/>
-            </w:pPr>
             <w:r/>
             <w:r>
               <w:rPr>
                 <w:b w:val="0"/>
                 <w:sz w:val="17"/>
               </w:rPr>
-              <w:t>지역, 진료과, 증상, 의사 코멘트, 점검할 문장</w:t>
+              <w:t>키워드 입력, 글 생성, 표현 점검, 결과 확인</w:t>
             </w:r>
           </w:p>
         </w:tc>
@@ -2913,16 +2526,13 @@
             <w:vAlign w:val="center"/>
           </w:tcPr>
           <w:p>
-            <w:pPr>
-              <w:spacing w:after="0"/>
-            </w:pPr>
             <w:r/>
             <w:r>
               <w:rPr>
                 <w:b w:val="0"/>
                 <w:sz w:val="17"/>
               </w:rPr>
-              <w:t>Process</w:t>
+              <w:t>입력 항목</w:t>
             </w:r>
           </w:p>
         </w:tc>
@@ -2932,16 +2542,13 @@
             <w:vAlign w:val="center"/>
           </w:tcPr>
           <w:p>
-            <w:pPr>
-              <w:spacing w:after="0"/>
-            </w:pPr>
             <w:r/>
             <w:r>
               <w:rPr>
                 <w:b w:val="0"/>
                 <w:sz w:val="17"/>
               </w:rPr>
-              <w:t>제목 추천, 글 구조 생성, 위험 표현 탐지, 대체 표현 제안</w:t>
+              <w:t>지역, 진료과, 증상/검사 키워드, 의사 코멘트, 점검할 문장</w:t>
             </w:r>
           </w:p>
         </w:tc>
@@ -2953,16 +2560,13 @@
             <w:vAlign w:val="center"/>
           </w:tcPr>
           <w:p>
-            <w:pPr>
-              <w:spacing w:after="0"/>
-            </w:pPr>
             <w:r/>
             <w:r>
               <w:rPr>
                 <w:b w:val="0"/>
                 <w:sz w:val="17"/>
               </w:rPr>
-              <w:t>Output</w:t>
+              <w:t>출력 항목</w:t>
             </w:r>
           </w:p>
         </w:tc>
@@ -2972,16 +2576,13 @@
             <w:vAlign w:val="center"/>
           </w:tcPr>
           <w:p>
-            <w:pPr>
-              <w:spacing w:after="0"/>
-            </w:pPr>
             <w:r/>
             <w:r>
               <w:rPr>
                 <w:b w:val="0"/>
                 <w:sz w:val="17"/>
               </w:rPr>
-              <w:t>블로그 제목, 글 구성안, 위험 표현 점검 결과, 안전 문구</w:t>
+              <w:t>추천 제목, 글 구조, 의료광고 위험 표현, 대체 표현, 안전 문구</w:t>
             </w:r>
           </w:p>
         </w:tc>
@@ -2993,16 +2594,13 @@
             <w:vAlign w:val="center"/>
           </w:tcPr>
           <w:p>
-            <w:pPr>
-              <w:spacing w:after="0"/>
-            </w:pPr>
             <w:r/>
             <w:r>
               <w:rPr>
                 <w:b w:val="0"/>
                 <w:sz w:val="17"/>
               </w:rPr>
-              <w:t>Review</w:t>
+              <w:t>화면 흐름</w:t>
             </w:r>
           </w:p>
         </w:tc>
@@ -3012,16 +2610,13 @@
             <w:vAlign w:val="center"/>
           </w:tcPr>
           <w:p>
-            <w:pPr>
-              <w:spacing w:after="0"/>
-            </w:pPr>
             <w:r/>
             <w:r>
               <w:rPr>
                 <w:b w:val="0"/>
                 <w:sz w:val="17"/>
               </w:rPr>
-              <w:t>의료진이 최종 확인하고 표현을 수정한 뒤 발행</w:t>
+              <w:t>입력 화면 → 생성 버튼 → 결과 화면 → 의료진 검토 → 발행</w:t>
             </w:r>
           </w:p>
         </w:tc>
@@ -3032,32 +2627,32 @@
         <w:pStyle w:val="Heading2"/>
       </w:pPr>
       <w:r>
-        <w:t>4.1 기능 구조</w:t>
+        <w:t>4.1 기능별 화면 설계</w:t>
       </w:r>
     </w:p>
     <w:p>
       <w:r>
-        <w:t>키워드 입력 모듈: 지역·진료과·증상 입력값 정리</w:t>
+        <w:t>키워드 입력 화면: 지역·진료과·증상 입력값을 받는다.</w:t>
       </w:r>
     </w:p>
     <w:p>
       <w:r>
-        <w:t>제목 추천 모듈: 검색 의도를 반영한 제목 생성</w:t>
+        <w:t>글 생성 화면: 입력값을 바탕으로 제목과 글 구조를 생성한다.</w:t>
       </w:r>
     </w:p>
     <w:p>
       <w:r>
-        <w:t>글 구조 생성 모듈: 환자 눈높이 구성 생성</w:t>
+        <w:t>표현 점검 화면: 완치, 100%, 부작용 없음 등 위험 표현을 탐지한다.</w:t>
       </w:r>
     </w:p>
     <w:p>
       <w:r>
-        <w:t>위험 표현 점검 모듈: 금지·주의 표현 탐지</w:t>
+        <w:t>결과 확인 화면: 최종 초안, FAQ, 안전 문구, 대체 표현을 보여준다.</w:t>
       </w:r>
     </w:p>
     <w:p>
       <w:r>
-        <w:t>결과 출력 모듈: 글 기획안과 점검 결과 출력</w:t>
+        <w:t>의료진 검토 화면: 발행 전 원장이 수정할 수 있도록 결과를 정리한다.</w:t>
       </w:r>
     </w:p>
     <w:p>
@@ -3097,9 +2692,6 @@
             <w:shd w:fill="DDEFEA"/>
           </w:tcPr>
           <w:p>
-            <w:pPr>
-              <w:spacing w:after="0"/>
-            </w:pPr>
             <w:r/>
             <w:r>
               <w:rPr>
@@ -3117,9 +2709,6 @@
             <w:shd w:fill="DDEFEA"/>
           </w:tcPr>
           <w:p>
-            <w:pPr>
-              <w:spacing w:after="0"/>
-            </w:pPr>
             <w:r/>
             <w:r>
               <w:rPr>
@@ -3138,9 +2727,6 @@
             <w:vAlign w:val="center"/>
           </w:tcPr>
           <w:p>
-            <w:pPr>
-              <w:spacing w:after="0"/>
-            </w:pPr>
             <w:r/>
             <w:r>
               <w:rPr>
@@ -3157,9 +2743,6 @@
             <w:vAlign w:val="center"/>
           </w:tcPr>
           <w:p>
-            <w:pPr>
-              <w:spacing w:after="0"/>
-            </w:pPr>
             <w:r/>
             <w:r>
               <w:rPr>
@@ -3178,9 +2761,6 @@
             <w:vAlign w:val="center"/>
           </w:tcPr>
           <w:p>
-            <w:pPr>
-              <w:spacing w:after="0"/>
-            </w:pPr>
             <w:r/>
             <w:r>
               <w:rPr>
@@ -3197,9 +2777,6 @@
             <w:vAlign w:val="center"/>
           </w:tcPr>
           <w:p>
-            <w:pPr>
-              <w:spacing w:after="0"/>
-            </w:pPr>
             <w:r/>
             <w:r>
               <w:rPr>
@@ -3218,9 +2795,6 @@
             <w:vAlign w:val="center"/>
           </w:tcPr>
           <w:p>
-            <w:pPr>
-              <w:spacing w:after="0"/>
-            </w:pPr>
             <w:r/>
             <w:r>
               <w:rPr>
@@ -3237,9 +2811,6 @@
             <w:vAlign w:val="center"/>
           </w:tcPr>
           <w:p>
-            <w:pPr>
-              <w:spacing w:after="0"/>
-            </w:pPr>
             <w:r/>
             <w:r>
               <w:rPr>
@@ -3258,9 +2829,6 @@
             <w:vAlign w:val="center"/>
           </w:tcPr>
           <w:p>
-            <w:pPr>
-              <w:spacing w:after="0"/>
-            </w:pPr>
             <w:r/>
             <w:r>
               <w:rPr>
@@ -3277,9 +2845,6 @@
             <w:vAlign w:val="center"/>
           </w:tcPr>
           <w:p>
-            <w:pPr>
-              <w:spacing w:after="0"/>
-            </w:pPr>
             <w:r/>
             <w:r>
               <w:rPr>
@@ -3298,9 +2863,6 @@
             <w:vAlign w:val="center"/>
           </w:tcPr>
           <w:p>
-            <w:pPr>
-              <w:spacing w:after="0"/>
-            </w:pPr>
             <w:r/>
             <w:r>
               <w:rPr>
@@ -3317,9 +2879,6 @@
             <w:vAlign w:val="center"/>
           </w:tcPr>
           <w:p>
-            <w:pPr>
-              <w:spacing w:after="0"/>
-            </w:pPr>
             <w:r/>
             <w:r>
               <w:rPr>
@@ -3383,9 +2942,6 @@
             <w:shd w:fill="DDEFEA"/>
           </w:tcPr>
           <w:p>
-            <w:pPr>
-              <w:spacing w:after="0"/>
-            </w:pPr>
             <w:r/>
             <w:r>
               <w:rPr>
@@ -3403,9 +2959,6 @@
             <w:shd w:fill="DDEFEA"/>
           </w:tcPr>
           <w:p>
-            <w:pPr>
-              <w:spacing w:after="0"/>
-            </w:pPr>
             <w:r/>
             <w:r>
               <w:rPr>
@@ -3423,9 +2976,6 @@
             <w:shd w:fill="DDEFEA"/>
           </w:tcPr>
           <w:p>
-            <w:pPr>
-              <w:spacing w:after="0"/>
-            </w:pPr>
             <w:r/>
             <w:r>
               <w:rPr>
@@ -3443,9 +2993,6 @@
             <w:shd w:fill="DDEFEA"/>
           </w:tcPr>
           <w:p>
-            <w:pPr>
-              <w:spacing w:after="0"/>
-            </w:pPr>
             <w:r/>
             <w:r>
               <w:rPr>
@@ -3464,9 +3011,6 @@
             <w:vAlign w:val="center"/>
           </w:tcPr>
           <w:p>
-            <w:pPr>
-              <w:spacing w:after="0"/>
-            </w:pPr>
             <w:r/>
             <w:r>
               <w:rPr>
@@ -3483,9 +3027,6 @@
             <w:vAlign w:val="center"/>
           </w:tcPr>
           <w:p>
-            <w:pPr>
-              <w:spacing w:after="0"/>
-            </w:pPr>
             <w:r/>
             <w:r>
               <w:rPr>
@@ -3502,9 +3043,6 @@
             <w:vAlign w:val="center"/>
           </w:tcPr>
           <w:p>
-            <w:pPr>
-              <w:spacing w:after="0"/>
-            </w:pPr>
             <w:r/>
             <w:r>
               <w:rPr>
@@ -3521,9 +3059,6 @@
             <w:vAlign w:val="center"/>
           </w:tcPr>
           <w:p>
-            <w:pPr>
-              <w:spacing w:after="0"/>
-            </w:pPr>
             <w:r/>
             <w:r>
               <w:rPr>
@@ -3542,9 +3077,6 @@
             <w:vAlign w:val="center"/>
           </w:tcPr>
           <w:p>
-            <w:pPr>
-              <w:spacing w:after="0"/>
-            </w:pPr>
             <w:r/>
             <w:r>
               <w:rPr>
@@ -3561,9 +3093,6 @@
             <w:vAlign w:val="center"/>
           </w:tcPr>
           <w:p>
-            <w:pPr>
-              <w:spacing w:after="0"/>
-            </w:pPr>
             <w:r/>
             <w:r>
               <w:rPr>
@@ -3580,9 +3109,6 @@
             <w:vAlign w:val="center"/>
           </w:tcPr>
           <w:p>
-            <w:pPr>
-              <w:spacing w:after="0"/>
-            </w:pPr>
             <w:r/>
             <w:r>
               <w:rPr>
@@ -3599,9 +3125,6 @@
             <w:vAlign w:val="center"/>
           </w:tcPr>
           <w:p>
-            <w:pPr>
-              <w:spacing w:after="0"/>
-            </w:pPr>
             <w:r/>
             <w:r>
               <w:rPr>
@@ -3620,9 +3143,6 @@
             <w:vAlign w:val="center"/>
           </w:tcPr>
           <w:p>
-            <w:pPr>
-              <w:spacing w:after="0"/>
-            </w:pPr>
             <w:r/>
             <w:r>
               <w:rPr>
@@ -3639,9 +3159,6 @@
             <w:vAlign w:val="center"/>
           </w:tcPr>
           <w:p>
-            <w:pPr>
-              <w:spacing w:after="0"/>
-            </w:pPr>
             <w:r/>
             <w:r>
               <w:rPr>
@@ -3658,9 +3175,6 @@
             <w:vAlign w:val="center"/>
           </w:tcPr>
           <w:p>
-            <w:pPr>
-              <w:spacing w:after="0"/>
-            </w:pPr>
             <w:r/>
             <w:r>
               <w:rPr>
@@ -3677,9 +3191,6 @@
             <w:vAlign w:val="center"/>
           </w:tcPr>
           <w:p>
-            <w:pPr>
-              <w:spacing w:after="0"/>
-            </w:pPr>
             <w:r/>
             <w:r>
               <w:rPr>
@@ -3698,9 +3209,6 @@
             <w:vAlign w:val="center"/>
           </w:tcPr>
           <w:p>
-            <w:pPr>
-              <w:spacing w:after="0"/>
-            </w:pPr>
             <w:r/>
             <w:r>
               <w:rPr>
@@ -3717,9 +3225,6 @@
             <w:vAlign w:val="center"/>
           </w:tcPr>
           <w:p>
-            <w:pPr>
-              <w:spacing w:after="0"/>
-            </w:pPr>
             <w:r/>
             <w:r>
               <w:rPr>
@@ -3736,9 +3241,6 @@
             <w:vAlign w:val="center"/>
           </w:tcPr>
           <w:p>
-            <w:pPr>
-              <w:spacing w:after="0"/>
-            </w:pPr>
             <w:r/>
             <w:r>
               <w:rPr>
@@ -3755,9 +3257,6 @@
             <w:vAlign w:val="center"/>
           </w:tcPr>
           <w:p>
-            <w:pPr>
-              <w:spacing w:after="0"/>
-            </w:pPr>
             <w:r/>
             <w:r>
               <w:rPr>
@@ -3776,9 +3275,6 @@
             <w:vAlign w:val="center"/>
           </w:tcPr>
           <w:p>
-            <w:pPr>
-              <w:spacing w:after="0"/>
-            </w:pPr>
             <w:r/>
             <w:r>
               <w:rPr>
@@ -3795,9 +3291,6 @@
             <w:vAlign w:val="center"/>
           </w:tcPr>
           <w:p>
-            <w:pPr>
-              <w:spacing w:after="0"/>
-            </w:pPr>
             <w:r/>
             <w:r>
               <w:rPr>
@@ -3814,9 +3307,6 @@
             <w:vAlign w:val="center"/>
           </w:tcPr>
           <w:p>
-            <w:pPr>
-              <w:spacing w:after="0"/>
-            </w:pPr>
             <w:r/>
             <w:r>
               <w:rPr>
@@ -3833,9 +3323,6 @@
             <w:vAlign w:val="center"/>
           </w:tcPr>
           <w:p>
-            <w:pPr>
-              <w:spacing w:after="0"/>
-            </w:pPr>
             <w:r/>
             <w:r>
               <w:rPr>
@@ -3857,9 +3344,6 @@
       </w:r>
     </w:p>
     <w:p>
-      <w:pPr>
-        <w:spacing w:after="80"/>
-      </w:pPr>
       <w:r>
         <w:t>1. 과학기술정보통신부·한국지능정보사회진흥원, 2024 인터넷이용실태조사(e-나라지표)</w:t>
         <w:br/>
@@ -3867,9 +3351,6 @@
       </w:r>
     </w:p>
     <w:p>
-      <w:pPr>
-        <w:spacing w:after="80"/>
-      </w:pPr>
       <w:r>
         <w:t>2. 질병관리청 국가건강정보포털 사업 개요</w:t>
         <w:br/>
@@ -3877,9 +3358,6 @@
       </w:r>
     </w:p>
     <w:p>
-      <w:pPr>
-        <w:spacing w:after="80"/>
-      </w:pPr>
       <w:r>
         <w:t>3. 정희태·김정아, 의료소비자의 인터넷 기반 의료정보서비스 이용행태와 병원선택, Healthcare Informatics Research, KCI</w:t>
         <w:br/>
@@ -3887,9 +3365,6 @@
       </w:r>
     </w:p>
     <w:p>
-      <w:pPr>
-        <w:spacing w:after="80"/>
-      </w:pPr>
       <w:r>
         <w:t>4. 의료법 제56조 의료광고의 금지 등, 국가법령정보센터</w:t>
         <w:br/>
@@ -3897,9 +3372,6 @@
       </w:r>
     </w:p>
     <w:p>
-      <w:pPr>
-        <w:spacing w:after="80"/>
-      </w:pPr>
       <w:r>
         <w:t>5. BMC Health Services Research, Popularity of internet physician rating sites and their apparent influence on patients’ choices of physicians</w:t>
         <w:br/>
@@ -4370,7 +3842,7 @@
       <w:rFonts w:asciiTheme="majorHAnsi" w:eastAsiaTheme="majorEastAsia" w:hAnsiTheme="majorHAnsi" w:cstheme="majorBidi" w:ascii="Arial" w:hAnsi="Arial" w:eastAsia="맑은 고딕"/>
       <w:b/>
       <w:bCs/>
-      <w:color w:val="1F2937"/>
+      <w:color w:val="4F81BD" w:themeColor="accent1"/>
       <w:sz w:val="26"/>
       <w:szCs w:val="26"/>
     </w:rPr>

</xml_diff>